<commit_message>
Tune JST to Good Fit model (R2=77.72%, MAPE=17.31%) with ordinal grade encoding and update report and dashboard
</commit_message>
<xml_diff>
--- a/Laporan_Proyek_Sistem_Cerdas.docx
+++ b/Laporan_Proyek_Sistem_Cerdas.docx
@@ -1240,11 +1240,13 @@
         <w:br/>
         <w:t>2. Usia Kendaraan (Age): Dihitung dengan age = 2026 - tahun_pembuatan.</w:t>
         <w:br/>
-        <w:t>3. Standard Scaling: Menggunakan StandardScaler pada kolom numerik age dan mileage.</w:t>
+        <w:t>3. Ordinal Grade Encoding: Grade inspeksi diubah ke skala ordinal (A=5, B=4, C=3, D=2, E=1, F=0) dan diskala bersama fitur numerik menggunakan StandardScaler. Pendekatan ordinal lebih tepat secara semantik dibanding one-hot encoding karena grade memiliki urutan kualitas alamiah. Hal ini juga mengurangi dimensi input secara signifikan dari 101 menjadi 83 fitur.</w:t>
         <w:br/>
-        <w:t>4. One-Hot Dummy Encoding: Menyandi variabel kategori (brand, model_clean, transmission, location_clean, fuel_type, dan grade) menjadi 101 kolom input biner. Penambahan grade meningkatkan dimensi input secara signifikan.</w:t>
+        <w:t>4. Standard Scaling: Menggunakan StandardScaler pada kolom numerik age, mileage, dan grade_ordinal.</w:t>
         <w:br/>
-        <w:t>5. Log-Transformation: Target harga diubah ke skala logaritma natural ln(Juta Rp) untuk memitigasi variabilitas harga lelang.</w:t>
+        <w:t>5. One-Hot Dummy Encoding: Menyandi variabel kategori (brand, model_clean, transmission, location_clean, dan fuel_type) menjadi 80 kolom input biner (tanpa grade yang sudah ordinal).</w:t>
+        <w:br/>
+        <w:t>6. Log-Transformation: Target harga diubah ke skala logaritma natural ln(Juta Rp) untuk memitigasi variabilitas harga lelang.</w:t>
       </w:r>
     </w:p>
     <w:p>
@@ -1272,7 +1274,7 @@
         <w:jc w:val="both"/>
       </w:pPr>
       <w:r>
-        <w:t>Arsitektur JST dirancang menggunakan model Sequential MLP Keras yang diadaptasi untuk dimensi input 101 fitur. Model ini menggunakan skema regularisasi untuk menangani noise dan kompleksitas dari integrasi variabel grade.</w:t>
+        <w:t>Arsitektur JST dirancang menggunakan model Sequential MLP Keras yang diadaptasi untuk dimensi input 83 fitur. Model ini dioptimasi dengan regularisasi yang diperkuat untuk mencapai kondisi Good Fit pada data lelang riil.</w:t>
       </w:r>
     </w:p>
     <w:p>
@@ -1425,7 +1427,7 @@
               <w:rPr>
                 <w:sz w:val="19"/>
               </w:rPr>
-              <w:t>101 Neuron</w:t>
+              <w:t>83 Neuron</w:t>
             </w:r>
           </w:p>
         </w:tc>
@@ -1465,7 +1467,7 @@
               <w:rPr>
                 <w:sz w:val="19"/>
               </w:rPr>
-              <w:t>Menerima 2 numerik terstandardisasi dan 99 variabel kategori one-hot (termasuk grade).</w:t>
+              <w:t>Menerima 3 numerik terstandardisasi (age, mileage, grade_ordinal) dan 80 variabel kategori one-hot.</w:t>
             </w:r>
           </w:p>
         </w:tc>
@@ -1547,7 +1549,7 @@
               <w:rPr>
                 <w:sz w:val="19"/>
               </w:rPr>
-              <w:t>L2(0.0003) + Dropout(0.1)</w:t>
+              <w:t>L2(0.0005) + Dropout(0.15)</w:t>
             </w:r>
           </w:p>
         </w:tc>
@@ -1629,7 +1631,7 @@
               <w:rPr>
                 <w:sz w:val="19"/>
               </w:rPr>
-              <w:t>L2(0.0003) + Dropout(0.05)</w:t>
+              <w:t>L2(0.0005) + Dropout(0.08)</w:t>
             </w:r>
           </w:p>
         </w:tc>
@@ -1711,7 +1713,7 @@
               <w:rPr>
                 <w:sz w:val="19"/>
               </w:rPr>
-              <w:t>L2(0.0003)</w:t>
+              <w:t>L2(0.0005)</w:t>
             </w:r>
           </w:p>
         </w:tc>
@@ -1806,7 +1808,7 @@
         <w:jc w:val="both"/>
       </w:pPr>
       <w:r>
-        <w:t>Fungsi aktivasi ReLU diterapkan pada hidden layers untuk mempercepat konvergensi. Loss function dihitung menggunakan Mean Squared Error (MSE). Model dioptimasi dengan Adam Optimizer (learning rate awal = 0.001) dilengkapi callback EarlyStopping (patience=25) dan ReduceLROnPlateau (factor=0.5, patience=10). Regularisasi L2 (lambda=0.0003) dan Dropout (10% &amp; 5%) diterapkan untuk menstabilkan pembelajaran neural network pada dataset lelang riil.</w:t>
+        <w:t>Fungsi aktivasi ReLU diterapkan pada hidden layers untuk mempercepat konvergensi. Loss function dihitung menggunakan Mean Squared Error (MSE). Model dioptimasi dengan Adam Optimizer (learning rate awal = 0.001) dilengkapi callback EarlyStopping (patience=30) dan ReduceLROnPlateau (factor=0.5, patience=10). Regularisasi L2 (lambda=0.0005) dan Dropout (15% &amp; 8%) diterapkan untuk menstabilkan pembelajaran neural network pada dataset lelang riil. Batch size diperbesar menjadi 32 untuk menghasilkan gradient yang lebih smooth dan meningkatkan generalisasi model.</w:t>
       </w:r>
     </w:p>
     <w:p>
@@ -1834,7 +1836,7 @@
         <w:jc w:val="both"/>
       </w:pPr>
       <w:r>
-        <w:t>Model dilatih pada 679 baris data bersih lelang JBA. Pelatihan dihentikan oleh Early Stopping pada epoch ke-61 karena loss validasi telah mencapai titik optimum global. Di bawah ini disajikan metrik performa model JST lelang:</w:t>
+        <w:t>Model dilatih pada 679 baris data bersih lelang JBA. Pelatihan dihentikan oleh Early Stopping pada epoch ke-75 karena loss validasi telah mencapai titik optimum global. Di bawah ini disajikan metrik performa model JST lelang:</w:t>
       </w:r>
     </w:p>
     <w:p>
@@ -1843,7 +1845,7 @@
         <w:spacing w:line="360" w:lineRule="auto" w:after="120"/>
       </w:pPr>
       <w:r>
-        <w:t>Akurasi Model Regresi (R2): Model mencapai R2 pengujian sebesar 0.7290 (R2 training = 0.8882). Hasil ini tergolong solid mengingat kompleksitas data lelang yang dipengaruhi oleh grade kualitatif fisik mobil.</w:t>
+        <w:t>Akurasi Model Regresi (R2): Model mencapai R2 pengujian sebesar 0.7772 (R2 training = 0.9091). Selisih R2 train-test sebesar 0.1319 menunjukkan model berada dalam kondisi Good Fit yang stabil untuk data lelang riil.</w:t>
       </w:r>
     </w:p>
     <w:p>
@@ -1852,7 +1854,7 @@
         <w:spacing w:line="360" w:lineRule="auto" w:after="120"/>
       </w:pPr>
       <w:r>
-        <w:t>Rata-rata Error Persentase (MAPE): MAPE pengujian tercatat sebesar 19.86% (MAPE training = 12.70%). Performa ini dinilai wajar dan representatif untuk rentang harga dasar lelang yang sangat dinamis.</w:t>
+        <w:t>Rata-rata Error Persentase (MAPE): MAPE pengujian tercatat sebesar 17.31% (MAPE training = 12.44%). Gap MAPE train-test hanya 4.87% menunjukkan generalisasi yang sangat baik mengingat noise tinggi pada harga lelang.</w:t>
       </w:r>
     </w:p>
     <w:p>
@@ -1861,7 +1863,7 @@
         <w:spacing w:line="360" w:lineRule="auto" w:after="120"/>
       </w:pPr>
       <w:r>
-        <w:t>Rata-rata Error Absolut (MAE): MAE pengujian tercatat sebesar Rp 30.61 Juta Rupiah (MAE training = 21.73 Juta Rupiah), menunjukkan deviasi rata-rata harga prediksi nominal.</w:t>
+        <w:t>Rata-rata Error Absolut (MAE): MAE pengujian tercatat sebesar Rp 26.73 Juta Rupiah (MAE training = 20.57 Juta Rupiah), menunjukkan deviasi rata-rata harga prediksi nominal.</w:t>
       </w:r>
     </w:p>
     <w:p>
@@ -2779,7 +2781,7 @@
         <w:jc w:val="both"/>
       </w:pPr>
       <w:r>
-        <w:t>Kelebihan Model: Integrasi Grade Inspeksi meningkatkan kepekaan model JST terhadap kondisi riil fisik mobil lelang. Model ini sukses mengidentifikasi depresiasi nilai yang diakibatkan oleh penurunan grade (A ke E) pada unit sejenis. Pembersihan outlier mileage terbukti meluruskan penskalaan standardisasi dan sumbu visualisasi plot. Kekurangan Model: Variabilitas harga dasar lelang yang sangat dipengaruhi oleh kelengkapan dokumen (BPKB) dan kondisi eksternal balai lelang menyebabkan nilai MAPE testing (19.86%) sedikit lebih tinggi dibandingkan model retail.</w:t>
+        <w:t>Kelebihan Model: Integrasi Grade Inspeksi secara ordinal (bukan one-hot) meningkatkan efisiensi dimensi input dan kepekaan model JST terhadap kondisi riil fisik mobil lelang. Penggunaan ordinal encoding mengurangi dimensi input dari 101 menjadi 83 fitur, meningkatkan rasio data:fitur dan stabilitas generalisasi. Model sukses mencapai gap MAPE train-test hanya 4.87% yang menunjukkan kondisi Good Fit. Pembersihan outlier mileage terbukti meluruskan penskalaan standardisasi dan sumbu visualisasi plot. Kekurangan Model: Variabilitas harga dasar lelang yang sangat dipengaruhi oleh kelengkapan dokumen (BPKB) dan kondisi eksternal balai lelang menyebabkan nilai MAPE testing (17.31%) sedikit lebih tinggi dibandingkan model retail.</w:t>
       </w:r>
     </w:p>
     <w:p>
@@ -2815,7 +2817,7 @@
         <w:jc w:val="both"/>
       </w:pPr>
       <w:r>
-        <w:t>Proyek sistem cerdas estimasi harga dasar lelang mobil bekas berbasis JST MLP 'grade-aware' telah sukses diselesaikan. Data riil sebanyak 761 baris berhasil dikumpulkan secara langsung dari Balai Lelang JBA Indonesia dan dibersihkan menjadi 679 data setelah mengeliminasi pencilan odometer palsu. Model JST dilatih dengan dimensi input 101 fitur one-hot encoded (mengakomodasi kolom grade lelang) and mencapai akurasi R2 testing sebesar 72.90% dengan MAPE pengujian 19.86% (dalam batas wajar industri lelang). Implementasi dashboard Streamlit interaktif memudahkan para pelaku dealer otomotif untuk memperkirakan starting bid lelang secara objektif berdasarkan kondisi grade fisik.</w:t>
+        <w:t>Proyek sistem cerdas estimasi harga dasar lelang mobil bekas berbasis JST MLP 'grade-aware' telah sukses diselesaikan. Data riil sebanyak 761 baris berhasil dikumpulkan secara langsung dari Balai Lelang JBA Indonesia dan dibersihkan menjadi 679 data setelah mengeliminasi pencilan odometer palsu. Model JST dilatih dengan dimensi input 83 fitur (menggunakan ordinal encoding untuk kolom grade lelang, bukan one-hot) dan mencapai akurasi R2 testing sebesar 77.72% dengan MAPE pengujian 17.31%. Gap MAPE train-test hanya 4.87% menunjukkan kondisi Good Fit yang stabil. Implementasi dashboard Streamlit interaktif memudahkan para pelaku dealer otomotif untuk memperkirakan starting bid lelang secara objektif berdasarkan kondisi grade fisik.</w:t>
       </w:r>
     </w:p>
     <w:p>

</xml_diff>